<commit_message>
Revise per peer review: one-tailed hypothesis tests, corroborating Trump-approval analysis, proofreading pass
Addresses all must-fix/should-fix items from a simulated peer review:
reframes H1/H2 around one-tailed tests (directional, unthresholded
preregistration) with a new term-by-term hypothesis scorecard table,
substantiates the floor-effect claim with control-condition means,
specifies the conRep/libDem ideology cutoffs, tightens the novelty claim,
and adds sample-representativeness and manipulation-check caveats.

Adds a Trump-approval corroborating analysis to the main manuscript
(moved out of supplemental materials): a balance check plus a predicted-
support figure across continuous approval x cue condition, showing the
Trump-cue effect scales with approval for all five actions.

Full proofreading pass (typos, grammar, hyphenation, p-value formatting)
and abstract trimmed to the target journal's 250-word limit.

Co-Authored-By: Claude Sonnet 5 <noreply@anthropic.com>
</commit_message>
<xml_diff>
--- a/_output/cue-actions-supplemental.docx
+++ b/_output/cue-actions-supplemental.docx
@@ -9170,6 +9170,14 @@
         </w:tc>
       </w:tr>
     </w:tbl>
+    <w:p>
+      <w:pPr>
+        <w:pStyle w:val="BodyText"/>
+      </w:pPr>
+      <w:r>
+        <w:t xml:space="preserve">Note: the Trump-approval corroborating analysis (a continuous, post-treatment measure of Trump approval substituted for the ideology x party identity measures) is reported in the manuscript’s Results section rather than here, since it bears directly on the main text’s interpretation of the Trump-cue mechanism.</w:t>
+      </w:r>
+    </w:p>
     <w:bookmarkEnd w:id="19"/>
     <w:bookmarkEnd w:id="20"/>
     <w:sectPr>

</xml_diff>